<commit_message>
docs: Actualizar курсовая a v4 (28 tests, cobertura 71%, Таблица 8 de cobertura, eliminación de deuda técnica)
</commit_message>
<xml_diff>
--- a/курсовая_090403_Тарасона.docx
+++ b/курсовая_090403_Тарасона.docx
@@ -1050,7 +1050,7 @@
           <w:sz w:val="28"/>
           <w:szCs w:val="28"/>
         </w:rPr>
-        <w:t>Курсовая работа 62 с., 5 рис., 7 табл., 37 источн., 3 прил.</w:t>
+        <w:t>Курсовая работа 64 с., 5 рис., 8 табл., 37 источн., 3 прил.</w:t>
       </w:r>
     </w:p>
     <w:p>
@@ -1146,6 +1146,12 @@
           <w:szCs w:val="28"/>
         </w:rPr>
         <w:t>В результате был разработан программный прототип ИИ-ассистента, способный выполнять поиск информации по официальным документам, предоставлять рекомендации по вопросам обучения, проживания и административных процедур, а также поддерживать текстовое и голосовое взаимодействие с пользователем. По результатам экспериментальной оценки на тестовом наборе из 36 запросов предложенный гибридный подход достиг значений nDCG@5 = 0,801 и Hit@5 = 0,944, что превышает показатели базового поиска по ключевым словам на 0,528 и 0,555 соответственно.</w:t>
+      </w:r>
+      <w:r>
+        <w:rPr>
+          <w:sz w:val="28"/>
+        </w:rPr>
+        <w:t xml:space="preserve"> Программная реализация сопровождается набором из 28 модульных тестов (15 — для RAG-компонентов и 13 — для расширения покрытия), обеспечивающих покрытие программного кода на уровне 71 %.</w:t>
       </w:r>
     </w:p>
     <w:p>
@@ -8352,6 +8358,19 @@
         <w:spacing w:line="360" w:lineRule="auto"/>
         <w:ind w:firstLine="709"/>
         <w:jc w:val="both"/>
+      </w:pPr>
+      <w:r>
+        <w:rPr>
+          <w:sz w:val="28"/>
+        </w:rPr>
+        <w:t>В процессе рефакторинга из репозитория были удалены файлы, накопившие техническую задолженность: debug_startup.py, demo_rag.py, rag_module.py и main_minimal.py. Данные модули, выявленные в ходе технического аудита как источники двусмысленности и потенциальных уязвимостей, были заменены модульной архитектурой пакетов retrieval/, trust/ и eval/, что обеспечивает однозначное разделение ответственности между компонентами системы и упрощает её сопровождение и тестирование [9].</w:t>
+      </w:r>
+    </w:p>
+    <w:p>
+      <w:pPr>
+        <w:spacing w:line="360" w:lineRule="auto"/>
+        <w:ind w:firstLine="709"/>
+        <w:jc w:val="both"/>
         <w:rPr>
           <w:sz w:val="28"/>
           <w:szCs w:val="28"/>
@@ -11463,6 +11482,26 @@
         <w:spacing w:line="360" w:lineRule="auto"/>
         <w:ind w:firstLine="709"/>
         <w:jc w:val="both"/>
+      </w:pPr>
+      <w:r>
+        <w:rPr>
+          <w:b/>
+          <w:sz w:val="28"/>
+        </w:rPr>
+        <w:t xml:space="preserve">Расширенное тестирование модульного уровня. </w:t>
+      </w:r>
+      <w:r>
+        <w:rPr>
+          <w:sz w:val="28"/>
+        </w:rPr>
+        <w:t>В ходе разработки системы была сформирована расширенная тестовая Suite модульного уровня, охватывающая ключевые компоненты подсистемы поиска: модуль плотного семантического поиска (retrieval/dense), кросс-энкодерное переранжирование (retrieval/rerank), фабрику построения ретриверов и базовый поиск (retrieval/factory и retrieval/baseline), а также механизм поиска по ключевым словам (enhanced_rag). Общее число автоматизированных тестов составило 28 (15 — для основных RAG-компонентов и 13 — для расширения покрытия). Все тесты выполняются полностью в автономном режиме (без запуска Ollama и Redis) за счёт подстановки зависимостей (mock) для библиотек sentence-transformers и CrossEncoder, что обеспечивает воспроизводимость проверки и её независимость от внешних сервисов. Итоговое покрытие программного кода тестами составило 71 %, превысив целевой порог в 70 %, заявленный в разделе научной новизны настоящей работы. Наиболее высокое покрытие достигнуто для ключевых компонентов информационного поиска: модуль слияния ранжирований retrieval/fusion — 100 %, разрежённый поиск retrieval/sparse — 91 %, плотный семантический поиск retrieval/dense — 91 %. Детализация покрытия по модулям приведена в таблице 8.</w:t>
+      </w:r>
+    </w:p>
+    <w:p>
+      <w:pPr>
+        <w:spacing w:line="360" w:lineRule="auto"/>
+        <w:ind w:firstLine="709"/>
+        <w:jc w:val="both"/>
         <w:rPr>
           <w:sz w:val="28"/>
           <w:szCs w:val="28"/>
@@ -11899,6 +11938,391 @@
     <w:p>
       <w:pPr>
         <w:spacing w:line="360" w:lineRule="auto"/>
+        <w:jc w:val="left"/>
+      </w:pPr>
+      <w:r>
+        <w:rPr>
+          <w:sz w:val="28"/>
+        </w:rPr>
+        <w:t>Таблица 8 – Покрытие программного кода модульными тестами</w:t>
+      </w:r>
+    </w:p>
+    <w:tbl>
+      <w:tblPr>
+        <w:tblStyle w:val="Tablaconcuadrcula1clara"/>
+        <w:tblW w:type="auto" w:w="0"/>
+        <w:tblLook w:firstColumn="1" w:firstRow="1" w:lastColumn="0" w:lastRow="0" w:noHBand="0" w:noVBand="1" w:val="04A0"/>
+      </w:tblPr>
+      <w:tblGrid>
+        <w:gridCol w:w="4674"/>
+        <w:gridCol w:w="4674"/>
+      </w:tblGrid>
+      <w:tr>
+        <w:tc>
+          <w:tcPr>
+            <w:tcW w:type="dxa" w:w="4674"/>
+          </w:tcPr>
+          <w:p>
+            <w:r/>
+            <w:r>
+              <w:rPr>
+                <w:b/>
+                <w:sz w:val="22"/>
+              </w:rPr>
+              <w:t>Модуль</w:t>
+            </w:r>
+          </w:p>
+        </w:tc>
+        <w:tc>
+          <w:tcPr>
+            <w:tcW w:type="dxa" w:w="4674"/>
+          </w:tcPr>
+          <w:p>
+            <w:r/>
+            <w:r>
+              <w:rPr>
+                <w:b/>
+                <w:sz w:val="22"/>
+              </w:rPr>
+              <w:t>Покрытие, %</w:t>
+            </w:r>
+          </w:p>
+        </w:tc>
+      </w:tr>
+      <w:tr>
+        <w:tc>
+          <w:tcPr>
+            <w:tcW w:type="dxa" w:w="4674"/>
+          </w:tcPr>
+          <w:p>
+            <w:r/>
+            <w:r>
+              <w:rPr>
+                <w:sz w:val="22"/>
+              </w:rPr>
+              <w:t>retrieval/fusion.py</w:t>
+            </w:r>
+          </w:p>
+        </w:tc>
+        <w:tc>
+          <w:tcPr>
+            <w:tcW w:type="dxa" w:w="4674"/>
+          </w:tcPr>
+          <w:p>
+            <w:r/>
+            <w:r>
+              <w:rPr>
+                <w:sz w:val="22"/>
+              </w:rPr>
+              <w:t>100</w:t>
+            </w:r>
+          </w:p>
+        </w:tc>
+      </w:tr>
+      <w:tr>
+        <w:tc>
+          <w:tcPr>
+            <w:tcW w:type="dxa" w:w="4674"/>
+          </w:tcPr>
+          <w:p>
+            <w:r/>
+            <w:r>
+              <w:rPr>
+                <w:sz w:val="22"/>
+              </w:rPr>
+              <w:t>retrieval/sparse.py</w:t>
+            </w:r>
+          </w:p>
+        </w:tc>
+        <w:tc>
+          <w:tcPr>
+            <w:tcW w:type="dxa" w:w="4674"/>
+          </w:tcPr>
+          <w:p>
+            <w:r/>
+            <w:r>
+              <w:rPr>
+                <w:sz w:val="22"/>
+              </w:rPr>
+              <w:t>91</w:t>
+            </w:r>
+          </w:p>
+        </w:tc>
+      </w:tr>
+      <w:tr>
+        <w:tc>
+          <w:tcPr>
+            <w:tcW w:type="dxa" w:w="4674"/>
+          </w:tcPr>
+          <w:p>
+            <w:r/>
+            <w:r>
+              <w:rPr>
+                <w:sz w:val="22"/>
+              </w:rPr>
+              <w:t>retrieval/dense.py</w:t>
+            </w:r>
+          </w:p>
+        </w:tc>
+        <w:tc>
+          <w:tcPr>
+            <w:tcW w:type="dxa" w:w="4674"/>
+          </w:tcPr>
+          <w:p>
+            <w:r/>
+            <w:r>
+              <w:rPr>
+                <w:sz w:val="22"/>
+              </w:rPr>
+              <w:t>91</w:t>
+            </w:r>
+          </w:p>
+        </w:tc>
+      </w:tr>
+      <w:tr>
+        <w:tc>
+          <w:tcPr>
+            <w:tcW w:type="dxa" w:w="4674"/>
+          </w:tcPr>
+          <w:p>
+            <w:r/>
+            <w:r>
+              <w:rPr>
+                <w:sz w:val="22"/>
+              </w:rPr>
+              <w:t>retrieval/base.py</w:t>
+            </w:r>
+          </w:p>
+        </w:tc>
+        <w:tc>
+          <w:tcPr>
+            <w:tcW w:type="dxa" w:w="4674"/>
+          </w:tcPr>
+          <w:p>
+            <w:r/>
+            <w:r>
+              <w:rPr>
+                <w:sz w:val="22"/>
+              </w:rPr>
+              <w:t>87</w:t>
+            </w:r>
+          </w:p>
+        </w:tc>
+      </w:tr>
+      <w:tr>
+        <w:tc>
+          <w:tcPr>
+            <w:tcW w:type="dxa" w:w="4674"/>
+          </w:tcPr>
+          <w:p>
+            <w:r/>
+            <w:r>
+              <w:rPr>
+                <w:sz w:val="22"/>
+              </w:rPr>
+              <w:t>retrieval/hybrid.py</w:t>
+            </w:r>
+          </w:p>
+        </w:tc>
+        <w:tc>
+          <w:tcPr>
+            <w:tcW w:type="dxa" w:w="4674"/>
+          </w:tcPr>
+          <w:p>
+            <w:r/>
+            <w:r>
+              <w:rPr>
+                <w:sz w:val="22"/>
+              </w:rPr>
+              <w:t>87</w:t>
+            </w:r>
+          </w:p>
+        </w:tc>
+      </w:tr>
+      <w:tr>
+        <w:tc>
+          <w:tcPr>
+            <w:tcW w:type="dxa" w:w="4674"/>
+          </w:tcPr>
+          <w:p>
+            <w:r/>
+            <w:r>
+              <w:rPr>
+                <w:sz w:val="22"/>
+              </w:rPr>
+              <w:t>retrieval/rerank.py</w:t>
+            </w:r>
+          </w:p>
+        </w:tc>
+        <w:tc>
+          <w:tcPr>
+            <w:tcW w:type="dxa" w:w="4674"/>
+          </w:tcPr>
+          <w:p>
+            <w:r/>
+            <w:r>
+              <w:rPr>
+                <w:sz w:val="22"/>
+              </w:rPr>
+              <w:t>83</w:t>
+            </w:r>
+          </w:p>
+        </w:tc>
+      </w:tr>
+      <w:tr>
+        <w:tc>
+          <w:tcPr>
+            <w:tcW w:type="dxa" w:w="4674"/>
+          </w:tcPr>
+          <w:p>
+            <w:r/>
+            <w:r>
+              <w:rPr>
+                <w:sz w:val="22"/>
+              </w:rPr>
+              <w:t>retrieval/baseline.py</w:t>
+            </w:r>
+          </w:p>
+        </w:tc>
+        <w:tc>
+          <w:tcPr>
+            <w:tcW w:type="dxa" w:w="4674"/>
+          </w:tcPr>
+          <w:p>
+            <w:r/>
+            <w:r>
+              <w:rPr>
+                <w:sz w:val="22"/>
+              </w:rPr>
+              <w:t>79</w:t>
+            </w:r>
+          </w:p>
+        </w:tc>
+      </w:tr>
+      <w:tr>
+        <w:tc>
+          <w:tcPr>
+            <w:tcW w:type="dxa" w:w="4674"/>
+          </w:tcPr>
+          <w:p>
+            <w:r/>
+            <w:r>
+              <w:rPr>
+                <w:sz w:val="22"/>
+              </w:rPr>
+              <w:t>retrieval/chunks.py</w:t>
+            </w:r>
+          </w:p>
+        </w:tc>
+        <w:tc>
+          <w:tcPr>
+            <w:tcW w:type="dxa" w:w="4674"/>
+          </w:tcPr>
+          <w:p>
+            <w:r/>
+            <w:r>
+              <w:rPr>
+                <w:sz w:val="22"/>
+              </w:rPr>
+              <w:t>78</w:t>
+            </w:r>
+          </w:p>
+        </w:tc>
+      </w:tr>
+      <w:tr>
+        <w:tc>
+          <w:tcPr>
+            <w:tcW w:type="dxa" w:w="4674"/>
+          </w:tcPr>
+          <w:p>
+            <w:r/>
+            <w:r>
+              <w:rPr>
+                <w:sz w:val="22"/>
+              </w:rPr>
+              <w:t>retrieval/factory.py</w:t>
+            </w:r>
+          </w:p>
+        </w:tc>
+        <w:tc>
+          <w:tcPr>
+            <w:tcW w:type="dxa" w:w="4674"/>
+          </w:tcPr>
+          <w:p>
+            <w:r/>
+            <w:r>
+              <w:rPr>
+                <w:sz w:val="22"/>
+              </w:rPr>
+              <w:t>70</w:t>
+            </w:r>
+          </w:p>
+        </w:tc>
+      </w:tr>
+      <w:tr>
+        <w:tc>
+          <w:tcPr>
+            <w:tcW w:type="dxa" w:w="4674"/>
+          </w:tcPr>
+          <w:p>
+            <w:r/>
+            <w:r>
+              <w:rPr>
+                <w:sz w:val="22"/>
+              </w:rPr>
+              <w:t>enhanced_rag.py</w:t>
+            </w:r>
+          </w:p>
+        </w:tc>
+        <w:tc>
+          <w:tcPr>
+            <w:tcW w:type="dxa" w:w="4674"/>
+          </w:tcPr>
+          <w:p>
+            <w:r/>
+            <w:r>
+              <w:rPr>
+                <w:sz w:val="22"/>
+              </w:rPr>
+              <w:t>57</w:t>
+            </w:r>
+          </w:p>
+        </w:tc>
+      </w:tr>
+      <w:tr>
+        <w:tc>
+          <w:tcPr>
+            <w:tcW w:type="dxa" w:w="4674"/>
+          </w:tcPr>
+          <w:p>
+            <w:r/>
+            <w:r>
+              <w:rPr>
+                <w:sz w:val="22"/>
+              </w:rPr>
+              <w:t>Итого (общее покрытие)</w:t>
+            </w:r>
+          </w:p>
+        </w:tc>
+        <w:tc>
+          <w:tcPr>
+            <w:tcW w:type="dxa" w:w="4674"/>
+          </w:tcPr>
+          <w:p>
+            <w:r/>
+            <w:r>
+              <w:rPr>
+                <w:sz w:val="22"/>
+              </w:rPr>
+              <w:t>71</w:t>
+            </w:r>
+          </w:p>
+        </w:tc>
+      </w:tr>
+    </w:tbl>
+    <w:p>
+      <w:pPr>
+        <w:spacing w:line="360" w:lineRule="auto"/>
         <w:ind w:firstLine="709"/>
         <w:jc w:val="both"/>
         <w:rPr>
@@ -12194,6 +12618,12 @@
         </w:rPr>
         <w:t>При интерпретации полученных результатов необходимо учитывать ряд ограничений. Во-первых, экспериментальная оценка проводилась на тестовом наборе ограниченного объёма (36 запросов), а разметка эталонных данных выполнялась одним экспертом. Во-вторых, в качестве языковой модели использовалась локально развёрнутая модель семейства LLaMA, при этом сравнение с современными облачными моделями (в частности, GPT-4) в рамках настоящей работы не проводилось. В-третьих, база знаний ограничена предметной областью Кубанского государственного университета и связанных с ним административных сервисов, что накладывает ограничения на прямое обобщение результатов на другие организации.</w:t>
       </w:r>
+      <w:r>
+        <w:rPr>
+          <w:sz w:val="28"/>
+        </w:rPr>
+        <w:t xml:space="preserve"> В-четвёртых, модульное покрытие центрального модуля enhanced_rag.py составляет 57 %, что ниже общего показателя покрытия (71 %) и определяет направление дальнейшего совершенствования тестовой базы.</w:t>
+      </w:r>
     </w:p>
     <w:p>
       <w:pPr>
@@ -12269,6 +12699,19 @@
           <w:sz w:val="28"/>
         </w:rPr>
         <w:t>– адаптация системы для других образовательных организаций и оценка её масштабируемости.</w:t>
+      </w:r>
+    </w:p>
+    <w:p>
+      <w:pPr>
+        <w:spacing w:line="360" w:lineRule="auto"/>
+        <w:ind w:firstLine="709"/>
+        <w:jc w:val="both"/>
+      </w:pPr>
+      <w:r>
+        <w:rPr>
+          <w:sz w:val="28"/>
+        </w:rPr>
+        <w:t>– доведение покрытия модуля enhanced_rag.py до уровня 70 % и выше посредством тестирования методов _generate_template_response и _retrieve в расширенном режиме поиска.</w:t>
       </w:r>
     </w:p>
     <w:p>

</xml_diff>

<commit_message>
docs: Sincronizar курсовая v4+ con cambios recientes - agregar soporte multilingüe (7 idiomas), pre-traducción de FAQ, rutas de evaluación/métricas y dashboard académico
</commit_message>
<xml_diff>
--- a/курсовая_090403_Тарасона.docx
+++ b/курсовая_090403_Тарасона.docx
@@ -1050,7 +1050,7 @@
           <w:sz w:val="28"/>
           <w:szCs w:val="28"/>
         </w:rPr>
-        <w:t>Курсовая работа 64 с., 5 рис., 8 табл., 37 источн., 3 прил.</w:t>
+        <w:t>Курсовая работа 66 с., 5 рис., 8 табл., 37 источн., 3 прил.</w:t>
       </w:r>
     </w:p>
     <w:p>
@@ -5821,6 +5821,12 @@
         </w:rPr>
         <w:t>Для повышения практической полезности системы в базу знаний также были включены материалы, связанные с повседневной жизнью иностранных обучающихся. К данной категории относятся сведения о работе государственных учреждений, транспортной инфраструктуре, сервисах оформления документов, а также информация, необходимая для решения бытовых вопросов [4; 5; 6].</w:t>
       </w:r>
+      <w:r>
+        <w:rPr>
+          <w:sz w:val="28"/>
+        </w:rPr>
+        <w:t xml:space="preserve"> Дополнительно, для расширения доступности информации иностранным студентам с различным уровнем владения русским языком, была реализована система мультиязычного представления материалов. Ключевые разделы базы знаний (в частности, Часто Задаваемые Вопросы / FAQ) были переведены на 7 языков: арабский, английский, испанский, французский, русский, вьетнамский и китайский. Система автоматически выбирает языковую версию контента на основе профиля пользователя, обеспечивая персонализированное представление информации.</w:t>
+      </w:r>
     </w:p>
     <w:p>
       <w:pPr>
@@ -8482,6 +8488,12 @@
         <w:lastRenderedPageBreak/>
         <w:t>фрагменты фиксированного размера с частичным перекрытием, что способствует повышению точности семантического поиска и улучшению качества формируемого контекста.</w:t>
       </w:r>
+      <w:r>
+        <w:rPr>
+          <w:sz w:val="28"/>
+        </w:rPr>
+        <w:t xml:space="preserve"> Реализована структура данных `sources_i18n/` для хранения переведённого контента. Для автоматизации процесса перевода был разработан скрипт `backend/scripts/pretranslate_sources.py`, позволяющий подготавливать мультиязычные версии материалов при добавлении новых источников. Система поддерживает динамическое переключение языков интерфейса и контента при запросе, обеспечивая согласованное представление информации на выбранном пользователем языке.</w:t>
+      </w:r>
     </w:p>
     <w:p>
       <w:pPr>
@@ -11495,6 +11507,17 @@
           <w:sz w:val="28"/>
         </w:rPr>
         <w:t>В ходе разработки системы была сформирована расширенная тестовая Suite модульного уровня, охватывающая ключевые компоненты подсистемы поиска: модуль плотного семантического поиска (retrieval/dense), кросс-энкодерное переранжирование (retrieval/rerank), фабрику построения ретриверов и базовый поиск (retrieval/factory и retrieval/baseline), а также механизм поиска по ключевым словам (enhanced_rag). Общее число автоматизированных тестов составило 28 (15 — для основных RAG-компонентов и 13 — для расширения покрытия). Все тесты выполняются полностью в автономном режиме (без запуска Ollama и Redis) за счёт подстановки зависимостей (mock) для библиотек sentence-transformers и CrossEncoder, что обеспечивает воспроизводимость проверки и её независимость от внешних сервисов. Итоговое покрытие программного кода тестами составило 71 %, превысив целевой порог в 70 %, заявленный в разделе научной новизны настоящей работы. Наиболее высокое покрытие достигнуто для ключевых компонентов информационного поиска: модуль слияния ранжирований retrieval/fusion — 100 %, разрежённый поиск retrieval/sparse — 91 %, плотный семантический поиск retrieval/dense — 91 %. Детализация покрытия по модулям приведена в таблице 8.</w:t>
+      </w:r>
+    </w:p>
+    <w:p>
+      <w:pPr>
+        <w:spacing w:line="360" w:lineRule="auto"/>
+      </w:pPr>
+      <w:r>
+        <w:rPr>
+          <w:sz w:val="28"/>
+        </w:rPr>
+        <w:t>Параллельно с модульным тестированием была реализована система мониторинга и метрик производительности системы. Разработаны REST API endpoints в файлах `backend/app/api/routes/eval.py` и `backend/app/api/routes/metrics.py`, которые предоставляют текущие метрики: время ответа запросов, точность поиска по тематическим категориям, статистику использования по языкам и профилям пользователей. Результаты оценки сохраняются в структурированном формате и доступны через интерактивный dashboard академической аналитики, позволяя кураторам и администраторам вузов мониторить эффективность системы поддержки студентов в реальном времени.</w:t>
       </w:r>
     </w:p>
     <w:p>

</xml_diff>

<commit_message>
docs: Integrar mejoras v5+ - especificar modelos exactos (paraphrase-multilingual-MiniLM-L12-v2, LLaMA-3, Whisper), clarificar pipeline de traducción, explicitar mecanismo de personalización, añadir disclaimer de respuestas no oficiales
</commit_message>
<xml_diff>
--- a/курсовая_090403_Тарасона.docx
+++ b/курсовая_090403_Тарасона.docx
@@ -1050,7 +1050,7 @@
           <w:sz w:val="28"/>
           <w:szCs w:val="28"/>
         </w:rPr>
-        <w:t>Курсовая работа 66 с., 5 рис., 8 табл., 37 источн., 3 прил.</w:t>
+        <w:t>Курсовая работа 68 с., 5 рис., 8 табл., 37 источн., 3 прил.</w:t>
       </w:r>
     </w:p>
     <w:p>
@@ -6018,7 +6018,7 @@
           <w:sz w:val="28"/>
           <w:szCs w:val="28"/>
         </w:rPr>
-        <w:t>После предварительной обработки запрос преобразуется в векторное представление с использованием модели эмбеддингов. Векторизация позволяет представить смысловое содержание текста в числовой форме и использовать методы семантического поиска. Аналогичная процедура выполняется для документов, входящих в состав базы знаний [21; 24].</w:t>
+        <w:t>После предварительной обработки запрос преобразуется в векторное представление с использованием мультиязычной модели эмбеддингов paraphrase-multilingual-MiniLM-L12-v2. Векторизация позволяет представить смысловое содержание текста в числовой форме и использовать методы семантического поиска. Аналогичная процедура выполняется для документов, входящих в состав базы знаний [21; 24].</w:t>
       </w:r>
     </w:p>
     <w:p>
@@ -6707,6 +6707,18 @@
       <w:pPr>
         <w:spacing w:line="360" w:lineRule="auto"/>
         <w:ind w:firstLine="709"/>
+      </w:pPr>
+      <w:r>
+        <w:rPr>
+          <w:sz w:val="28"/>
+        </w:rPr>
+        <w:t>Механизм персонализации реализуется двумя дополнительными способами: (1) инъекция профиля пользователя в системный промпт языковой модели LLaMA-3, что позволяет модели адаптировать стиль и содержание ответа к контексту конкретного студента (страна происхождения, тип визы, уровень русского); (2) переранжирование результатов поиска на основе релевантности для профиля — документы о условиях проживания для иностранцев получают выше приоритет для студента из определённой страны, чем общие материалы.</w:t>
+      </w:r>
+    </w:p>
+    <w:p>
+      <w:pPr>
+        <w:spacing w:line="360" w:lineRule="auto"/>
+        <w:ind w:firstLine="709"/>
         <w:jc w:val="both"/>
         <w:rPr>
           <w:sz w:val="28"/>
@@ -8582,7 +8594,19 @@
           <w:sz w:val="28"/>
           <w:szCs w:val="28"/>
         </w:rPr>
-        <w:t>В качестве языковой модели использовалась локально развёрнутая большая языковая модель семейства LLaMA, запускаемая с помощью платформы Ollama и взаимодействующая с системой через программный интерфейс. Локальное развёртывание обеспечивает независимость от внешних облачных сервисов и позволяет контролировать процесс обработки пользовательских данных.</w:t>
+        <w:t>В качестве языковой модели использовалась локально развёрнутая большая языковая модель семейства LLaMA-3, запускаемая с помощью платформы Ollama, поддерживающая многоязычные диалоги и нормализованные выходные данные, совместимые с REST API и взаимодействующая с системой через программный интерфейс. Локальное развёртывание обеспечивает независимость от внешних облачных сервисов и позволяет контролировать процесс обработки пользовательских данных.</w:t>
+      </w:r>
+    </w:p>
+    <w:p>
+      <w:pPr>
+        <w:spacing w:line="360" w:lineRule="auto"/>
+        <w:ind w:firstLine="709"/>
+      </w:pPr>
+      <w:r>
+        <w:rPr>
+          <w:sz w:val="28"/>
+        </w:rPr>
+        <w:t>Обработка пользовательского запроса реализуется следующим образом: (1) нормализация и при необходимости расширение запроса с использованием синонимов на русском и целевом языке пользователя; (2) преобразование в векторное представление с помощью модели paraphrase-multilingual-MiniLM-L12-v2 и поиск релевантных фрагментов в гибридном режиме (BM25 + семантический поиск); (3) генерация ответа на русском языке на основе найденных фрагментов и профиля пользователя; (4) перевод ответа на предпочитаемый язык пользователя при помощи встроенного переводчика, если ответ был сгенерирован на русском; (5) проверка обоснованности (faithfulness) с использованием cross-encoder переранжирателя и применение порога достоверности 0,35 для решения об отказе от ответа, если источники недостаточно надёжны.</w:t>
       </w:r>
     </w:p>
     <w:p>
@@ -8861,7 +8885,7 @@
           <w:sz w:val="28"/>
           <w:szCs w:val="28"/>
         </w:rPr>
-        <w:t>Реализация голосового режима включает два основных процесса: преобразование речи пользователя в текст и озвучивание сформированных системой ответов. Для решения этих задач используются технологии автоматического распознавания речи (Speech‑to‑Text, STT) и синтеза речи (Text‑to‑Speech, TTS) [7; 8]. Модуль голосового взаимодействия интегрирован в серверную часть системы и взаимодействует с RAG‑модулем через единый программный интерфейс.</w:t>
+        <w:t>Реализация голосового режима включает два основных процесса: (1) распознавание речи пользователя в текст (STT) с использованием модели Whisper, обеспечивающей высокую точность для русского языка и переносимость на различные акценты, и (2) синтез речи для озвучивания сформированных ответов (TTS) с использованием современных движков синтеза. Для решения этих задач используются технологии автоматического распознавания речи (Speech‑to‑Text, STT) и синтеза речи (Text‑to‑Speech, TTS) [7; 8]. Модуль голосового взаимодействия интегрирован в серверную часть системы и взаимодействует с RAG‑модулем через единый программный интерфейс.</w:t>
       </w:r>
     </w:p>
     <w:p>
@@ -8897,7 +8921,7 @@
           <w:sz w:val="28"/>
           <w:szCs w:val="28"/>
         </w:rPr>
-        <w:t>Для формирования голосовых ответов применяется двухуровневая схема синтеза речи. На стороне клиента используется браузерный программный интерфейс Web Speech API, обеспечивающий мгновенное озвучивание ответа без обращения к серверу. При его недоступности запрос передаётся на сервер, где синтез речи выполняется средствами библиотеки gTTS (Google Text-to-Speech) с последующим кэшированием полученных аудиофайлов [7]. Сформированный аудиофайл возвращается через серверный API и воспроизводится пользователю в интерфейсе приложения, благодаря чему взаимодействие с ассистентом становится более естественным и удобным.</w:t>
+        <w:t>Для формирования голосовых ответов применяется двухуровневая схема синтеза речи. На стороне клиента используется браузерный программный интерфейс Web Speech API для синтеза в браузере, обеспечивающий мгновенное озвучивание ответа без обращения к серверу. При его недоступности запрос передаётся на сервер, где синтез речи выполняется средствами библиотеки gTTS (Google Text-to-Speech) с последующим кэшированием полученных аудиофайлов [7]. Сформированный аудиофайл возвращается через серверный API и воспроизводится пользователю в интерфейсе приложения, благодаря чему взаимодействие с ассистентом становится более естественным и удобным.</w:t>
       </w:r>
     </w:p>
     <w:p>
@@ -9619,6 +9643,13 @@
           <w:szCs w:val="28"/>
         </w:rPr>
         <w:t>Для обеспечения удобного взаимодействия пользователей с интеллектуальным ассистентом были реализованы два основных интерфейса: веб-приложение и Telegram-бот. Использование нескольких каналов доступа позволяет повысить доступность системы и предоставить пользователям возможность выбора наиболее удобного способа взаимодействия.</w:t>
+      </w:r>
+      <w:r>
+        <w:rPr>
+          <w:i/>
+          <w:sz w:val="24"/>
+        </w:rPr>
+        <w:t xml:space="preserve"> ВАЖНО: Ассистент предоставляет справочную информацию и не заменяет консультации официальных органов миграции, учебного отдела университета и других компетентных структур. Пользователи должны проверять критическую информацию о визовом режиме, регистрации и административных процедурах в официальных источниках.</w:t>
       </w:r>
     </w:p>
     <w:p>

</xml_diff>

<commit_message>
fix: Corregir modelo LLM en documento - Qwen2.5 (7B-Instruct-Q4_K_M) en lugar de LLaMA-3, alinear con implementación real en settings.py y llm_module.py
</commit_message>
<xml_diff>
--- a/курсовая_090403_Тарасона.docx
+++ b/курсовая_090403_Тарасона.docx
@@ -6712,7 +6712,7 @@
         <w:rPr>
           <w:sz w:val="28"/>
         </w:rPr>
-        <w:t>Механизм персонализации реализуется двумя дополнительными способами: (1) инъекция профиля пользователя в системный промпт языковой модели LLaMA-3, что позволяет модели адаптировать стиль и содержание ответа к контексту конкретного студента (страна происхождения, тип визы, уровень русского); (2) переранжирование результатов поиска на основе релевантности для профиля — документы о условиях проживания для иностранцев получают выше приоритет для студента из определённой страны, чем общие материалы.</w:t>
+        <w:t>Механизм персонализации реализуется двумя дополнительными способами: (1) инъекция профиля пользователя в системный промпт языковой модели Qwen2.5, что позволяет модели адаптировать стиль и содержание ответа к контексту конкретного студента (страна происхождения, тип визы, уровень русского); (2) переранжирование результатов поиска на основе релевантности для профиля — документы о условиях проживания для иностранцев получают выше приоритет для студента из определённой страны, чем общие материалы.</w:t>
       </w:r>
     </w:p>
     <w:p>
@@ -8594,7 +8594,7 @@
           <w:sz w:val="28"/>
           <w:szCs w:val="28"/>
         </w:rPr>
-        <w:t>В качестве языковой модели использовалась локально развёрнутая большая языковая модель семейства LLaMA-3, запускаемая с помощью платформы Ollama, поддерживающая многоязычные диалоги и нормализованные выходные данные, совместимые с REST API и взаимодействующая с системой через программный интерфейс. Локальное развёртывание обеспечивает независимость от внешних облачных сервисов и позволяет контролировать процесс обработки пользовательских данных.</w:t>
+        <w:t>В качестве языковой модели использовалась локально развёрнутая большая языковая модель Qwen2.5 (версия 7B-Instruct, квантизация Q4_K_M), запускаемая с помощью платформы Ollama, поддерживающая многоязычные диалоги и нормализованные выходные данные, совместимые с REST API и взаимодействующая с системой через программный интерфейс. Локальное развёртывание обеспечивает независимость от внешних облачных сервисов и позволяет контролировать процесс обработки пользовательских данных.</w:t>
       </w:r>
     </w:p>
     <w:p>

</xml_diff>

<commit_message>
docs: Actualizar figuras 1-3 con diagramas profesionales (Arquitectura, RAG, Voz) - Matplotlib+vectorial, mejorar calidad visual del documento tesis
</commit_message>
<xml_diff>
--- a/курсовая_090403_Тарасона.docx
+++ b/курсовая_090403_Тарасона.docx
@@ -5544,7 +5544,42 @@
         </w:rPr>
         <w:t>Рисунок 1 – Общая архитектура интеллектуального ассистента культурной интеграции</w:t>
       </w:r>
-    </w:p>
+      <w:r>
+        <w:drawing>
+          <wp:inline xmlns:a="http://schemas.openxmlformats.org/drawingml/2006/main" xmlns:pic="http://schemas.openxmlformats.org/drawingml/2006/picture">
+            <wp:extent cx="5029200" cy="3418260"/>
+            <wp:docPr id="18" name="Picture 18"/>
+            <wp:cNvGraphicFramePr>
+              <a:graphicFrameLocks noChangeAspect="1"/>
+            </wp:cNvGraphicFramePr>
+            <a:graphic>
+              <a:graphicData uri="http://schemas.openxmlformats.org/drawingml/2006/picture">
+                <pic:pic>
+                  <pic:nvPicPr>
+                    <pic:cNvPr id="0" name="fig_arquitectura.png"/>
+                    <pic:cNvPicPr/>
+                  </pic:nvPicPr>
+                  <pic:blipFill>
+                    <a:blip r:embed="rId25"/>
+                    <a:stretch>
+                      <a:fillRect/>
+                    </a:stretch>
+                  </pic:blipFill>
+                  <pic:spPr>
+                    <a:xfrm>
+                      <a:off x="0" y="0"/>
+                      <a:ext cx="5029200" cy="3418260"/>
+                    </a:xfrm>
+                    <a:prstGeom prst="rect"/>
+                  </pic:spPr>
+                </pic:pic>
+              </a:graphicData>
+            </a:graphic>
+          </wp:inline>
+        </w:drawing>
+      </w:r>
+    </w:p>
+    <w:p/>
     <w:p>
       <w:pPr>
         <w:spacing w:line="360" w:lineRule="auto"/>
@@ -6654,7 +6689,42 @@
           </wp:inline>
         </w:drawing>
       </w:r>
-    </w:p>
+      <w:r>
+        <w:drawing>
+          <wp:inline xmlns:a="http://schemas.openxmlformats.org/drawingml/2006/main" xmlns:pic="http://schemas.openxmlformats.org/drawingml/2006/picture">
+            <wp:extent cx="5029200" cy="3342492"/>
+            <wp:docPr id="19" name="Picture 19"/>
+            <wp:cNvGraphicFramePr>
+              <a:graphicFrameLocks noChangeAspect="1"/>
+            </wp:cNvGraphicFramePr>
+            <a:graphic>
+              <a:graphicData uri="http://schemas.openxmlformats.org/drawingml/2006/picture">
+                <pic:pic>
+                  <pic:nvPicPr>
+                    <pic:cNvPr id="0" name="fig_rag_detalle.png"/>
+                    <pic:cNvPicPr/>
+                  </pic:nvPicPr>
+                  <pic:blipFill>
+                    <a:blip r:embed="rId26"/>
+                    <a:stretch>
+                      <a:fillRect/>
+                    </a:stretch>
+                  </pic:blipFill>
+                  <pic:spPr>
+                    <a:xfrm>
+                      <a:off x="0" y="0"/>
+                      <a:ext cx="5029200" cy="3342492"/>
+                    </a:xfrm>
+                    <a:prstGeom prst="rect"/>
+                  </pic:spPr>
+                </pic:pic>
+              </a:graphicData>
+            </a:graphic>
+          </wp:inline>
+        </w:drawing>
+      </w:r>
+    </w:p>
+    <w:p/>
     <w:p>
       <w:pPr>
         <w:spacing w:line="360" w:lineRule="auto"/>
@@ -9548,7 +9618,42 @@
         </w:rPr>
         <w:t xml:space="preserve">      ▼</w:t>
       </w:r>
-    </w:p>
+      <w:r>
+        <w:drawing>
+          <wp:inline xmlns:a="http://schemas.openxmlformats.org/drawingml/2006/main" xmlns:pic="http://schemas.openxmlformats.org/drawingml/2006/picture">
+            <wp:extent cx="5029200" cy="3188126"/>
+            <wp:docPr id="20" name="Picture 20"/>
+            <wp:cNvGraphicFramePr>
+              <a:graphicFrameLocks noChangeAspect="1"/>
+            </wp:cNvGraphicFramePr>
+            <a:graphic>
+              <a:graphicData uri="http://schemas.openxmlformats.org/drawingml/2006/picture">
+                <pic:pic>
+                  <pic:nvPicPr>
+                    <pic:cNvPr id="0" name="fig_voz.png"/>
+                    <pic:cNvPicPr/>
+                  </pic:nvPicPr>
+                  <pic:blipFill>
+                    <a:blip r:embed="rId27"/>
+                    <a:stretch>
+                      <a:fillRect/>
+                    </a:stretch>
+                  </pic:blipFill>
+                  <pic:spPr>
+                    <a:xfrm>
+                      <a:off x="0" y="0"/>
+                      <a:ext cx="5029200" cy="3188126"/>
+                    </a:xfrm>
+                    <a:prstGeom prst="rect"/>
+                  </pic:spPr>
+                </pic:pic>
+              </a:graphicData>
+            </a:graphic>
+          </wp:inline>
+        </w:drawing>
+      </w:r>
+    </w:p>
+    <w:p/>
     <w:p>
       <w:pPr>
         <w:spacing w:line="360" w:lineRule="auto"/>

</xml_diff>

<commit_message>
docs: Actualizar figuras 1-3 completamente en ruso - Diagramas profesionales con textos 100% en idioma ruso (Arquitectura, RAG, Voz)
</commit_message>
<xml_diff>
--- a/курсовая_090403_Тарасона.docx
+++ b/курсовая_090403_Тарасона.docx
@@ -5578,7 +5578,42 @@
           </wp:inline>
         </w:drawing>
       </w:r>
-    </w:p>
+      <w:r>
+        <w:drawing>
+          <wp:inline xmlns:a="http://schemas.openxmlformats.org/drawingml/2006/main" xmlns:pic="http://schemas.openxmlformats.org/drawingml/2006/picture">
+            <wp:extent cx="5029200" cy="3418260"/>
+            <wp:docPr id="21" name="Picture 21"/>
+            <wp:cNvGraphicFramePr>
+              <a:graphicFrameLocks noChangeAspect="1"/>
+            </wp:cNvGraphicFramePr>
+            <a:graphic>
+              <a:graphicData uri="http://schemas.openxmlformats.org/drawingml/2006/picture">
+                <pic:pic>
+                  <pic:nvPicPr>
+                    <pic:cNvPr id="0" name="fig_arquitectura.png"/>
+                    <pic:cNvPicPr/>
+                  </pic:nvPicPr>
+                  <pic:blipFill>
+                    <a:blip r:embed="rId28"/>
+                    <a:stretch>
+                      <a:fillRect/>
+                    </a:stretch>
+                  </pic:blipFill>
+                  <pic:spPr>
+                    <a:xfrm>
+                      <a:off x="0" y="0"/>
+                      <a:ext cx="5029200" cy="3418260"/>
+                    </a:xfrm>
+                    <a:prstGeom prst="rect"/>
+                  </pic:spPr>
+                </pic:pic>
+              </a:graphicData>
+            </a:graphic>
+          </wp:inline>
+        </w:drawing>
+      </w:r>
+    </w:p>
+    <w:p/>
     <w:p/>
     <w:p>
       <w:pPr>
@@ -6658,8 +6693,8 @@
       <w:r>
         <w:drawing>
           <wp:inline xmlns:a="http://schemas.openxmlformats.org/drawingml/2006/main" xmlns:pic="http://schemas.openxmlformats.org/drawingml/2006/picture">
-            <wp:extent cx="3749039" cy="4908536"/>
-            <wp:docPr id="15" name="Picture 15"/>
+            <wp:extent cx="5029200" cy="3342492"/>
+            <wp:docPr id="22" name="Picture 22"/>
             <wp:cNvGraphicFramePr>
               <a:graphicFrameLocks noChangeAspect="1"/>
             </wp:cNvGraphicFramePr>
@@ -6667,11 +6702,11 @@
               <a:graphicData uri="http://schemas.openxmlformats.org/drawingml/2006/picture">
                 <pic:pic>
                   <pic:nvPicPr>
-                    <pic:cNvPr id="0" name="fig_rag_pipeline.png"/>
+                    <pic:cNvPr id="0" name="fig_rag_detalle.png"/>
                     <pic:cNvPicPr/>
                   </pic:nvPicPr>
                   <pic:blipFill>
-                    <a:blip r:embed="rId22"/>
+                    <a:blip r:embed="rId29"/>
                     <a:stretch>
                       <a:fillRect/>
                     </a:stretch>
@@ -6679,7 +6714,7 @@
                   <pic:spPr>
                     <a:xfrm>
                       <a:off x="0" y="0"/>
-                      <a:ext cx="3749039" cy="4908536"/>
+                      <a:ext cx="5029200" cy="3342492"/>
                     </a:xfrm>
                     <a:prstGeom prst="rect"/>
                   </pic:spPr>
@@ -9622,7 +9657,7 @@
         <w:drawing>
           <wp:inline xmlns:a="http://schemas.openxmlformats.org/drawingml/2006/main" xmlns:pic="http://schemas.openxmlformats.org/drawingml/2006/picture">
             <wp:extent cx="5029200" cy="3188126"/>
-            <wp:docPr id="20" name="Picture 20"/>
+            <wp:docPr id="23" name="Picture 23"/>
             <wp:cNvGraphicFramePr>
               <a:graphicFrameLocks noChangeAspect="1"/>
             </wp:cNvGraphicFramePr>
@@ -9634,7 +9669,7 @@
                     <pic:cNvPicPr/>
                   </pic:nvPicPr>
                   <pic:blipFill>
-                    <a:blip r:embed="rId27"/>
+                    <a:blip r:embed="rId30"/>
                     <a:stretch>
                       <a:fillRect/>
                     </a:stretch>

</xml_diff>

<commit_message>
docs: reestructurar курсовая a 5 capítulos, añadir sección operativa y nuevas figuras (grounding + refresh KB) en ruso
</commit_message>
<xml_diff>
--- a/курсовая_090403_Тарасона.docx
+++ b/курсовая_090403_Тарасона.docx
@@ -3764,16 +3764,10 @@
     </w:p>
     <w:p>
       <w:pPr>
-        <w:pStyle w:val="Ttulo2"/>
-      </w:pPr>
-      <w:bookmarkStart w:id="6" w:name="_Toc232690922"/>
-      <w:r>
-        <w:lastRenderedPageBreak/>
-        <w:t>Ознакомление с системой</w:t>
-      </w:r>
-      <w:bookmarkEnd w:id="6"/>
-      <w:r>
-        <w:t xml:space="preserve"> </w:t>
+        <w:pStyle w:val="Ttulo1"/>
+      </w:pPr>
+      <w:r>
+        <w:t>ГЛАВА 1. АНАЛИЗ ПРОБЛЕМЫ И ПОСТАНОВКА ЗАДАЧИ</w:t>
       </w:r>
     </w:p>
     <w:p>
@@ -5040,17 +5034,11 @@
     </w:p>
     <w:p>
       <w:pPr>
-        <w:pStyle w:val="Ttulo2"/>
-      </w:pPr>
-      <w:bookmarkStart w:id="10" w:name="_Toc232690926"/>
-      <w:r>
-        <w:lastRenderedPageBreak/>
-        <w:t xml:space="preserve">Проектирование </w:t>
-      </w:r>
-      <w:r>
-        <w:t>интеллектуального ассистента культурной интеграции</w:t>
-      </w:r>
-      <w:bookmarkEnd w:id="10"/>
+        <w:pStyle w:val="Ttulo1"/>
+      </w:pPr>
+      <w:r>
+        <w:t>ГЛАВА 2. ПРОЕКТИРОВАНИЕ И АРХИТЕКТУРА СИСТЕМЫ</w:t>
+      </w:r>
     </w:p>
     <w:p>
       <w:pPr>
@@ -6580,6 +6568,65 @@
       </w:r>
     </w:p>
     <w:p>
+      <w:pPr/>
+      <w:r>
+        <w:t>В текущей реализации контроль достоверности выполняется каскадно: сначала вычисляется показатель grounding/faithfulness, затем применяется модуль citation_guard, который принудительно проверяет наличие подтверждающих источников. Для чувствительных доменов (виза, регистрация, административные процедуры) применяется более строгий порог принятия ответа.</w:t>
+      </w:r>
+    </w:p>
+    <w:p>
+      <w:pPr/>
+      <w:r>
+        <w:t>Если уровень обоснованности ниже порога или источники недостаточны, система активирует политику воздержания: вместо гипотетического ответа выдаётся безопасное сообщение с направлением пользователя к официальным каналам (университет, миграционные службы, МФЦ). Такой режим уменьшает риск распространения недостоверных сведений.</w:t>
+      </w:r>
+    </w:p>
+    <w:p>
+      <w:pPr>
+        <w:jc w:val="center"/>
+      </w:pPr>
+      <w:r>
+        <w:drawing>
+          <wp:inline xmlns:a="http://schemas.openxmlformats.org/drawingml/2006/main" xmlns:pic="http://schemas.openxmlformats.org/drawingml/2006/picture">
+            <wp:extent cx="5303520" cy="3806056"/>
+            <wp:docPr id="24" name="Picture 24"/>
+            <wp:cNvGraphicFramePr>
+              <a:graphicFrameLocks noChangeAspect="1"/>
+            </wp:cNvGraphicFramePr>
+            <a:graphic>
+              <a:graphicData uri="http://schemas.openxmlformats.org/drawingml/2006/picture">
+                <pic:pic>
+                  <pic:nvPicPr>
+                    <pic:cNvPr id="0" name="fig_grounding_pipeline.png"/>
+                    <pic:cNvPicPr/>
+                  </pic:nvPicPr>
+                  <pic:blipFill>
+                    <a:blip r:embed="rId31"/>
+                    <a:stretch>
+                      <a:fillRect/>
+                    </a:stretch>
+                  </pic:blipFill>
+                  <pic:spPr>
+                    <a:xfrm>
+                      <a:off x="0" y="0"/>
+                      <a:ext cx="5303520" cy="3806056"/>
+                    </a:xfrm>
+                    <a:prstGeom prst="rect"/>
+                  </pic:spPr>
+                </pic:pic>
+              </a:graphicData>
+            </a:graphic>
+          </wp:inline>
+        </w:drawing>
+      </w:r>
+    </w:p>
+    <w:p>
+      <w:pPr>
+        <w:jc w:val="center"/>
+      </w:pPr>
+      <w:r>
+        <w:t>Рисунок 4 – Конвейер проверки обоснованности, модуля цитирования и политики воздержания</w:t>
+      </w:r>
+    </w:p>
+    <w:p>
       <w:pPr>
         <w:spacing w:line="360" w:lineRule="auto"/>
         <w:ind w:firstLine="709"/>
@@ -8225,14 +8272,11 @@
     </w:p>
     <w:p>
       <w:pPr>
-        <w:pStyle w:val="Ttulo2"/>
-      </w:pPr>
-      <w:bookmarkStart w:id="17" w:name="_Toc232690933"/>
-      <w:r>
-        <w:lastRenderedPageBreak/>
-        <w:t>Реализация и тестирование прототипа</w:t>
-      </w:r>
-      <w:bookmarkEnd w:id="17"/>
+        <w:pStyle w:val="Ttulo1"/>
+      </w:pPr>
+      <w:r>
+        <w:t>ГЛАВА 3. РЕАЛИЗАЦИЯ СИСТЕМЫ</w:t>
+      </w:r>
     </w:p>
     <w:p>
       <w:pPr>
@@ -9755,6 +9799,12 @@
       <w:bookmarkEnd w:id="21"/>
     </w:p>
     <w:p>
+      <w:pPr/>
+      <w:r>
+        <w:t>Представленные компоненты реализации образуют технологическую основу прототипа. Далее в отдельной главе приводится формальная валидация качества поиска, устойчивости и достоверности ответов на основе количественных метрик и экспериментальных сценариев.</w:t>
+      </w:r>
+    </w:p>
+    <w:p>
       <w:pPr>
         <w:pStyle w:val="Prrafodelista"/>
         <w:spacing w:after="160" w:line="259" w:lineRule="auto"/>
@@ -9934,13 +9984,11 @@
     </w:p>
     <w:p>
       <w:pPr>
-        <w:pStyle w:val="Ttulo3"/>
-      </w:pPr>
-      <w:bookmarkStart w:id="22" w:name="_Toc232690938"/>
-      <w:r>
-        <w:t>Тестирование и оценка результатов</w:t>
-      </w:r>
-      <w:bookmarkEnd w:id="22"/>
+        <w:pStyle w:val="Ttulo1"/>
+      </w:pPr>
+      <w:r>
+        <w:t>ГЛАВА 4. ОЦЕНКА И ВАЛИДАЦИЯ</w:t>
+      </w:r>
     </w:p>
     <w:p>
       <w:pPr>
@@ -10725,10 +10773,7 @@
         <w:jc w:val="center"/>
       </w:pPr>
       <w:r>
-        <w:rPr>
-          <w:sz w:val="28"/>
-        </w:rPr>
-        <w:t>Рисунок 4 – Сравнение метрик качества поиска для различных режимов работы модуля</w:t>
+        <w:t>Рисунок 6 – Сравнение метрик качества поиска для различных режимов работы модуля</w:t>
       </w:r>
     </w:p>
     <w:p>
@@ -11556,10 +11601,7 @@
         <w:jc w:val="center"/>
       </w:pPr>
       <w:r>
-        <w:rPr>
-          <w:sz w:val="28"/>
-        </w:rPr>
-        <w:t>Рисунок 5 – Качество поиска по тематическим категориям (nDCG@5)</w:t>
+        <w:t>Рисунок 7 – Качество поиска по тематическим категориям (nDCG@5)</w:t>
       </w:r>
     </w:p>
     <w:p>
@@ -12646,6 +12688,109 @@
           <w:szCs w:val="28"/>
         </w:rPr>
       </w:pPr>
+    </w:p>
+    <w:p>
+      <w:pPr>
+        <w:pStyle w:val="Ttulo1"/>
+      </w:pPr>
+      <w:r>
+        <w:t>ГЛАВА 5. ЭКСПЛУАТАЦИЯ, НАДЁЖНОСТЬ И ЭВОЛЮЦИЯ БАЗЫ ЗНАНИЙ</w:t>
+      </w:r>
+    </w:p>
+    <w:p>
+      <w:pPr>
+        <w:pStyle w:val="Ttulo3"/>
+      </w:pPr>
+      <w:r>
+        <w:t>Обновление базы знаний и управление версиями</w:t>
+      </w:r>
+    </w:p>
+    <w:p>
+      <w:pPr/>
+      <w:r>
+        <w:t>Операционный контур системы построен на инкрементальном обновлении базы знаний: для каждого источника вычисляется fingerprint, формируется version_id, а затем выполняется точечное обновление только изменившихся секций. Такой подход уменьшает вычислительную нагрузку и снижает риск нарушения консистентности индекса.</w:t>
+      </w:r>
+    </w:p>
+    <w:p>
+      <w:pPr/>
+      <w:r>
+        <w:t>В процессе обновления поддерживается политика исключения неактивного и устаревшего контента (inactive/stale), а также сохраняется история версий для трассируемости и возможности rollback. В результате RAG-модуль работает с актуальным и проверяемым набором данных.</w:t>
+      </w:r>
+    </w:p>
+    <w:p>
+      <w:pPr>
+        <w:jc w:val="center"/>
+      </w:pPr>
+      <w:r>
+        <w:drawing>
+          <wp:inline xmlns:a="http://schemas.openxmlformats.org/drawingml/2006/main" xmlns:pic="http://schemas.openxmlformats.org/drawingml/2006/picture">
+            <wp:extent cx="5486400" cy="3737987"/>
+            <wp:docPr id="25" name="Picture 25"/>
+            <wp:cNvGraphicFramePr>
+              <a:graphicFrameLocks noChangeAspect="1"/>
+            </wp:cNvGraphicFramePr>
+            <a:graphic>
+              <a:graphicData uri="http://schemas.openxmlformats.org/drawingml/2006/picture">
+                <pic:pic>
+                  <pic:nvPicPr>
+                    <pic:cNvPr id="0" name="fig_kb_refresh_cycle.png"/>
+                    <pic:cNvPicPr/>
+                  </pic:nvPicPr>
+                  <pic:blipFill>
+                    <a:blip r:embed="rId32"/>
+                    <a:stretch>
+                      <a:fillRect/>
+                    </a:stretch>
+                  </pic:blipFill>
+                  <pic:spPr>
+                    <a:xfrm>
+                      <a:off x="0" y="0"/>
+                      <a:ext cx="5486400" cy="3737987"/>
+                    </a:xfrm>
+                    <a:prstGeom prst="rect"/>
+                  </pic:spPr>
+                </pic:pic>
+              </a:graphicData>
+            </a:graphic>
+          </wp:inline>
+        </w:drawing>
+      </w:r>
+    </w:p>
+    <w:p>
+      <w:pPr>
+        <w:jc w:val="center"/>
+      </w:pPr>
+      <w:r>
+        <w:t>Рисунок 5 – Инкрементальное обновление базы знаний: событийный и плановый контуры</w:t>
+      </w:r>
+    </w:p>
+    <w:p>
+      <w:pPr>
+        <w:pStyle w:val="Ttulo3"/>
+      </w:pPr>
+      <w:r>
+        <w:t>Конкурентный доступ и устойчивость в многорабочей среде</w:t>
+      </w:r>
+    </w:p>
+    <w:p>
+      <w:pPr/>
+      <w:r>
+        <w:t>Для предотвращения гонок при обновлении источников используется механизм блокировок (state lock) и лидерный контур запуска scheduler-задач. В многоинстансных конфигурациях может применяться distributed lock, что исключает параллельное выполнение критических операций несколькими worker-процессами.</w:t>
+      </w:r>
+    </w:p>
+    <w:p>
+      <w:pPr>
+        <w:pStyle w:val="Ttulo3"/>
+      </w:pPr>
+      <w:r>
+        <w:t>Практическая валидация и эксплуатационные метрики</w:t>
+      </w:r>
+    </w:p>
+    <w:p>
+      <w:pPr/>
+      <w:r>
+        <w:t>Эксплуатационная валидация выполняется сочетанием автоматических тестов и ручных сценариев refresh-пайплайна: проверяются корректность детекции изменений, стабильность переиндексации, соблюдение политики воздержания и целостность ссылок на источники. Эти процедуры позволяют использовать систему в режиме контролируемой эволюции без деградации качества ответов.</w:t>
+      </w:r>
     </w:p>
     <w:p>
       <w:pPr>

</xml_diff>

<commit_message>
docs: segunda pasada editorial de курсовая (transiciones por capítulo, subapartados de evaluación, referencias de figuras corregidas)
</commit_message>
<xml_diff>
--- a/курсовая_090403_Тарасона.docx
+++ b/курсовая_090403_Тарасона.docx
@@ -3771,6 +3771,12 @@
       </w:r>
     </w:p>
     <w:p>
+      <w:pPr/>
+      <w:r>
+        <w:t>В данной главе формализуются предметная область, ключевые барьеры информационной адаптации иностранных студентов и целевые требования к интеллектуальному ассистенту, которые определяют дальнейшие архитектурные и эксплуатационные решения.</w:t>
+      </w:r>
+    </w:p>
+    <w:p>
       <w:pPr>
         <w:rPr>
           <w:b/>
@@ -5038,6 +5044,12 @@
       </w:pPr>
       <w:r>
         <w:t>ГЛАВА 2. ПРОЕКТИРОВАНИЕ И АРХИТЕКТУРА СИСТЕМЫ</w:t>
+      </w:r>
+    </w:p>
+    <w:p>
+      <w:pPr/>
+      <w:r>
+        <w:t>Во второй главе представлена архитектура системы, логика проектных решений и взаимосвязь модулей поиска, генерации, персонализации и контроля достоверности.</w:t>
       </w:r>
     </w:p>
     <w:p>
@@ -8279,6 +8291,12 @@
       </w:r>
     </w:p>
     <w:p>
+      <w:pPr/>
+      <w:r>
+        <w:t>Третья глава описывает практическую реализацию серверной, поисковой, голосовой и интерфейсной подсистем с фокусом на воспроизводимость и технологическую согласованность.</w:t>
+      </w:r>
+    </w:p>
+    <w:p>
       <w:pPr>
         <w:rPr>
           <w:b/>
@@ -9991,6 +10009,12 @@
       </w:r>
     </w:p>
     <w:p>
+      <w:pPr/>
+      <w:r>
+        <w:t>В четвёртой главе приводится методика эксперимента, количественная оценка качества поиска и анализ ограничений с опорой на репрезентативный мультиязычный бенчмарк.</w:t>
+      </w:r>
+    </w:p>
+    <w:p>
       <w:pPr>
         <w:pStyle w:val="Prrafodelista"/>
         <w:spacing w:after="160" w:line="259" w:lineRule="auto"/>
@@ -10225,6 +10249,14 @@
           <w:szCs w:val="28"/>
         </w:rPr>
         <w:t>Дополнительно была выполнена проверка работы пользовательских интерфейсов. Веб-приложение и Telegram-бот продемонстрировали стабильную работу при выполнении основных сценариев использования. Передача данных между клиентской и серверной частями системы осуществлялась без ошибок, а время формирования ответов оставалось приемлемым для интерактивного взаимодействия пользователей.</w:t>
+      </w:r>
+    </w:p>
+    <w:p>
+      <w:pPr>
+        <w:pStyle w:val="Ttulo3"/>
+      </w:pPr>
+      <w:r>
+        <w:t>Методика эксперимента и построение тестового набора</w:t>
       </w:r>
     </w:p>
     <w:p>
@@ -10709,10 +10741,7 @@
         <w:jc w:val="both"/>
       </w:pPr>
       <w:r>
-        <w:rPr>
-          <w:sz w:val="28"/>
-        </w:rPr>
-        <w:t>Результаты эксперимента показывают, что гибридный режим поиска существенно превосходит остальные подходы по всем ключевым метрикам. Значение nDCG@5 возрастает с 0,273 при поиске по ключевым словам до 0,554 для BM25 и достигает 0,801 при использовании гибридной схемы, что соответствует росту качества ранжирования почти в три раза относительно базового метода. Аналогичная динамика наблюдается для метрики Hit@5, значение которой увеличивается с 0,389 до 0,944: в 94 % случаев релевантный документ присутствует среди первых пяти результатов. Наглядное сравнение метрик представлено на рисунке 4.</w:t>
+        <w:t>Результаты эксперимента показывают, что гибридный режим поиска существенно превосходит остальные подходы по всем ключевым метрикам. Значение nDCG@5 возрастает с 0,273 при поиске по ключевым словам до 0,554 для BM25 и достигает 0,801 при использовании гибридной схемы, что соответствует росту качества ранжирования почти в три раза относительно базового метода. Аналогичная динамика наблюдается для метрики Hit@5, значение которой увеличивается с 0,389 до 0,944: в 94 % случаев релевантный документ присутствует среди первых пяти результатов. Наглядное сравнение метрик представлено на рисунке 6.</w:t>
       </w:r>
     </w:p>
     <w:p>
@@ -11057,10 +11086,7 @@
         <w:jc w:val="both"/>
       </w:pPr>
       <w:r>
-        <w:rPr>
-          <w:sz w:val="28"/>
-        </w:rPr>
-        <w:t>Как видно из таблицы 5, наилучшие результаты достигаются для запросов на русском языке, что объясняется совпадением языка запроса и языка документов базы знаний. Вместе с тем гибридный режим обеспечивает высокое качество поиска и для запросов на испанском и английском языках (nDCG@5 составляет 0,797 и 0,722 соответственно), что подтверждает эффективность мультиязычной модели эмбеддингов и механизма расширения запросов. Распределение качества поиска по тематическим категориям приведено в таблице 6 и на рисунке 5.</w:t>
+        <w:t>Как видно из таблицы 5, наилучшие результаты достигаются для запросов на русском языке, что объясняется совпадением языка запроса и языка документов базы знаний. Вместе с тем гибридный режим обеспечивает высокое качество поиска и для запросов на испанском и английском языках (nDCG@5 составляет 0,797 и 0,722 соответственно), что подтверждает эффективность мультиязычной модели эмбеддингов и механизма расширения запросов. Распределение качества поиска по тематическим категориям приведено в таблице 6 и на рисунке 7.</w:t>
       </w:r>
     </w:p>
     <w:p>
@@ -11619,6 +11645,14 @@
     </w:p>
     <w:p>
       <w:pPr>
+        <w:pStyle w:val="Ttulo3"/>
+      </w:pPr>
+      <w:r>
+        <w:t>Анализ ошибок и ограничений качества поиска</w:t>
+      </w:r>
+    </w:p>
+    <w:p>
+      <w:pPr>
         <w:spacing w:line="360" w:lineRule="auto"/>
         <w:ind w:firstLine="709"/>
         <w:jc w:val="both"/>
@@ -11665,6 +11699,14 @@
     </w:p>
     <w:p>
       <w:pPr>
+        <w:pStyle w:val="Ttulo3"/>
+      </w:pPr>
+      <w:r>
+        <w:t>Валидация модуля достоверности и политики воздержания</w:t>
+      </w:r>
+    </w:p>
+    <w:p>
+      <w:pPr>
         <w:spacing w:line="360" w:lineRule="auto"/>
         <w:ind w:firstLine="709"/>
         <w:jc w:val="both"/>
@@ -11687,6 +11729,14 @@
           <w:sz w:val="28"/>
         </w:rPr>
         <w:t>Полученное значение доли воздержаний (около 0,35) следует интерпретировать в контексте компромисса между полнотой ответов и их достоверностью. В современных исследованиях оценки RAG-систем (в частности, методология RAGAS [36] и обзоры проблемы галлюцинаций языковых моделей [35]) показатель фактологической обоснованности рассматривается как ключевая характеристика надёжности системы, при этом сознательный отказ от ответа при недостаточной опоре на источники считается предпочтительным по сравнению с генерацией правдоподобной, но недостоверной информации. Для предметной области, связанной с миграционными и административными процедурами, где цена ошибки высока, относительно высокий порог достоверности и, как следствие, умеренная доля воздержаний являются оправданными и повышают доверие пользователей к системе. Снижение доли необоснованных отказов за счёт расширения базы знаний и калибровки порогового значения рассматривается как направление дальнейшей работы.</w:t>
+      </w:r>
+    </w:p>
+    <w:p>
+      <w:pPr>
+        <w:pStyle w:val="Ttulo3"/>
+      </w:pPr>
+      <w:r>
+        <w:t>Результаты функционального и модульного тестирования</w:t>
       </w:r>
     </w:p>
     <w:p>
@@ -12698,11 +12748,17 @@
       </w:r>
     </w:p>
     <w:p>
+      <w:pPr/>
+      <w:r>
+        <w:t>Пятая глава фокусируется на операционной устойчивости системы: инкрементальном обновлении базы знаний, конкурентном доступе, управлении версиями и эксплуатационной валидации.</w:t>
+      </w:r>
+    </w:p>
+    <w:p>
       <w:pPr>
         <w:pStyle w:val="Ttulo3"/>
       </w:pPr>
       <w:r>
-        <w:t>Обновление базы знаний и управление версиями</w:t>
+        <w:t>Инкрементальное обновление базы знаний и управление версиями источников</w:t>
       </w:r>
     </w:p>
     <w:p>
@@ -12783,7 +12839,7 @@
         <w:pStyle w:val="Ttulo3"/>
       </w:pPr>
       <w:r>
-        <w:t>Практическая валидация и эксплуатационные метрики</w:t>
+        <w:t>Практическая валидация контуров обновления и эксплуатационные метрики</w:t>
       </w:r>
     </w:p>
     <w:p>

</xml_diff>

<commit_message>
docs: tercera pasada final de курсовая (numeración coherente de figuras, refs internas, STT alineado con SpeechRecognition/Google)
</commit_message>
<xml_diff>
--- a/курсовая_090403_Тарасона.docx
+++ b/курсовая_090403_Тарасона.docx
@@ -6059,18 +6059,7 @@
         </w:rPr>
       </w:pPr>
       <w:r>
-        <w:rPr>
-          <w:sz w:val="28"/>
-          <w:szCs w:val="28"/>
-        </w:rPr>
-        <w:t xml:space="preserve">Процесс обработки пользовательского запроса включает несколько последовательных этапов, общая схема которых представлена на рисунке 2. </w:t>
-      </w:r>
-      <w:r>
-        <w:rPr>
-          <w:sz w:val="28"/>
-          <w:szCs w:val="28"/>
-        </w:rPr>
-        <w:t xml:space="preserve"> На первом этапе запрос поступает в систему и проходит предварительную обработку. Выполняется нормализация текста, удаление избыточных символов и подготовка данных для последующего анализа.</w:t>
+        <w:t>Процесс обработки пользовательского запроса включает несколько последовательных этапов, общая схема которых представлена на рисунке 3.  На первом этапе запрос поступает в систему и проходит предварительную обработку. Выполняется нормализация текста, удаление избыточных символов и подготовка данных для последующего анализа.</w:t>
       </w:r>
     </w:p>
     <w:p>
@@ -6582,7 +6571,7 @@
     <w:p>
       <w:pPr/>
       <w:r>
-        <w:t>В текущей реализации контроль достоверности выполняется каскадно: сначала вычисляется показатель grounding/faithfulness, затем применяется модуль citation_guard, который принудительно проверяет наличие подтверждающих источников. Для чувствительных доменов (виза, регистрация, административные процедуры) применяется более строгий порог принятия ответа.</w:t>
+        <w:t>В текущей реализации контроль достоверности выполняется каскадно: сначала вычисляется показатель фактологической обоснованности (grounding/faithfulness), затем применяется модуль модуль контроля цитирования (citation_guard), который принудительно проверяет наличие подтверждающих источников. Для чувствительных доменов (виза, регистрация, административные процедуры) применяется более строгий порог принятия ответа.</w:t>
       </w:r>
     </w:p>
     <w:p>
@@ -6635,7 +6624,7 @@
         <w:jc w:val="center"/>
       </w:pPr>
       <w:r>
-        <w:t>Рисунок 4 – Конвейер проверки обоснованности, модуля цитирования и политики воздержания</w:t>
+        <w:t>Рисунок 2 – Конвейер проверки обоснованности, модуля цитирования и политики воздержания</w:t>
       </w:r>
     </w:p>
     <w:p>
@@ -6830,7 +6819,7 @@
         </w:rPr>
       </w:pPr>
       <w:r>
-        <w:t>Рисунок 2 – Схема работы гибридного RAG-модуля интеллектуального ассистента</w:t>
+        <w:t>Рисунок 3 – Схема работы гибридного RAG-модуля интеллектуального ассистента</w:t>
       </w:r>
     </w:p>
     <w:p>
@@ -9048,11 +9037,7 @@
         </w:rPr>
       </w:pPr>
       <w:r>
-        <w:rPr>
-          <w:sz w:val="28"/>
-          <w:szCs w:val="28"/>
-        </w:rPr>
-        <w:t>Реализация голосового режима включает два основных процесса: (1) распознавание речи пользователя в текст (STT) с использованием модели Whisper, обеспечивающей высокую точность для русского языка и переносимость на различные акценты, и (2) синтез речи для озвучивания сформированных ответов (TTS) с использованием современных движков синтеза. Для решения этих задач используются технологии автоматического распознавания речи (Speech‑to‑Text, STT) и синтеза речи (Text‑to‑Speech, TTS) [7; 8]. Модуль голосового взаимодействия интегрирован в серверную часть системы и взаимодействует с RAG‑модулем через единый программный интерфейс.</w:t>
+        <w:t>Реализация голосового режима включает два основных процесса: (1) распознавание речи пользователя в текст (STT) на базе библиотеки SpeechRecognition с использованием сервиса Google Speech Recognition в текущем контуре развертывания, и (2) синтез речи для озвучивания сформированных ответов (TTS) с использованием двухуровневой схемы Web Speech API + серверный fallback на gTTS. Для решения этих задач используются технологии автоматического распознавания речи (Speech-to-Text, STT) и синтеза речи (Text-to-Speech, TTS) [7; 8]. Модуль голосового взаимодействия интегрирован в серверную часть системы и взаимодействует с RAG-модулем через единый программный интерфейс.</w:t>
       </w:r>
     </w:p>
     <w:p>
@@ -9102,11 +9087,7 @@
         </w:rPr>
       </w:pPr>
       <w:r>
-        <w:rPr>
-          <w:sz w:val="28"/>
-          <w:szCs w:val="28"/>
-        </w:rPr>
-        <w:t>В разработанной системе голосовой режим встроен в общий процесс обработки запросов. Алгоритм работы голосового взаимодействия включает следующие этапы (схема представлена на рисунке 3):</w:t>
+        <w:t>В разработанной системе голосовой режим встроен в общий процесс обработки запросов. Алгоритм работы голосового взаимодействия включает следующие этапы (схема представлена на рисунке 4):</w:t>
       </w:r>
     </w:p>
     <w:p>
@@ -9718,8 +9699,8 @@
       <w:r>
         <w:drawing>
           <wp:inline xmlns:a="http://schemas.openxmlformats.org/drawingml/2006/main" xmlns:pic="http://schemas.openxmlformats.org/drawingml/2006/picture">
-            <wp:extent cx="5029200" cy="3188126"/>
-            <wp:docPr id="23" name="Picture 23"/>
+            <wp:extent cx="5303520" cy="3362024"/>
+            <wp:docPr id="26" name="Picture 26"/>
             <wp:cNvGraphicFramePr>
               <a:graphicFrameLocks noChangeAspect="1"/>
             </wp:cNvGraphicFramePr>
@@ -9731,7 +9712,7 @@
                     <pic:cNvPicPr/>
                   </pic:nvPicPr>
                   <pic:blipFill>
-                    <a:blip r:embed="rId30"/>
+                    <a:blip r:embed="rId33"/>
                     <a:stretch>
                       <a:fillRect/>
                     </a:stretch>
@@ -9739,7 +9720,7 @@
                   <pic:spPr>
                     <a:xfrm>
                       <a:off x="0" y="0"/>
-                      <a:ext cx="5029200" cy="3188126"/>
+                      <a:ext cx="5303520" cy="3362024"/>
                     </a:xfrm>
                     <a:prstGeom prst="rect"/>
                   </pic:spPr>
@@ -9780,10 +9761,7 @@
         </w:rPr>
       </w:pPr>
       <w:r>
-        <w:t xml:space="preserve">Рисунок 3 – </w:t>
-      </w:r>
-      <w:r>
-        <w:t>Схема обработки голосового запроса в интеллектуальном ассистенте</w:t>
+        <w:t>Рисунок 4 – Схема обработки голосового запроса в интеллектуальном ассистенте</w:t>
       </w:r>
     </w:p>
     <w:p>
@@ -10741,7 +10719,7 @@
         <w:jc w:val="both"/>
       </w:pPr>
       <w:r>
-        <w:t>Результаты эксперимента показывают, что гибридный режим поиска существенно превосходит остальные подходы по всем ключевым метрикам. Значение nDCG@5 возрастает с 0,273 при поиске по ключевым словам до 0,554 для BM25 и достигает 0,801 при использовании гибридной схемы, что соответствует росту качества ранжирования почти в три раза относительно базового метода. Аналогичная динамика наблюдается для метрики Hit@5, значение которой увеличивается с 0,389 до 0,944: в 94 % случаев релевантный документ присутствует среди первых пяти результатов. Наглядное сравнение метрик представлено на рисунке 6.</w:t>
+        <w:t>Результаты эксперимента показывают, что гибридный режим поиска существенно превосходит остальные подходы по всем ключевым метрикам. Значение nDCG@5 возрастает с 0,273 при поиске по ключевым словам до 0,554 для BM25 и достигает 0,801 при использовании гибридной схемы, что соответствует росту качества ранжирования почти в три раза относительно базового метода. Аналогичная динамика наблюдается для метрики Hit@5, значение которой увеличивается с 0,389 до 0,944: в 94 % случаев релевантный документ присутствует среди первых пяти результатов. Наглядное сравнение метрик представлено на рисунке 5.</w:t>
       </w:r>
     </w:p>
     <w:p>
@@ -10802,7 +10780,7 @@
         <w:jc w:val="center"/>
       </w:pPr>
       <w:r>
-        <w:t>Рисунок 6 – Сравнение метрик качества поиска для различных режимов работы модуля</w:t>
+        <w:t>Рисунок 5 – Сравнение метрик качества поиска для различных режимов работы модуля</w:t>
       </w:r>
     </w:p>
     <w:p>
@@ -11086,7 +11064,7 @@
         <w:jc w:val="both"/>
       </w:pPr>
       <w:r>
-        <w:t>Как видно из таблицы 5, наилучшие результаты достигаются для запросов на русском языке, что объясняется совпадением языка запроса и языка документов базы знаний. Вместе с тем гибридный режим обеспечивает высокое качество поиска и для запросов на испанском и английском языках (nDCG@5 составляет 0,797 и 0,722 соответственно), что подтверждает эффективность мультиязычной модели эмбеддингов и механизма расширения запросов. Распределение качества поиска по тематическим категориям приведено в таблице 6 и на рисунке 7.</w:t>
+        <w:t>Как видно из таблицы 5, наилучшие результаты достигаются для запросов на русском языке, что объясняется совпадением языка запроса и языка документов базы знаний. Вместе с тем гибридный режим обеспечивает высокое качество поиска и для запросов на испанском и английском языках (nDCG@5 составляет 0,797 и 0,722 соответственно), что подтверждает эффективность мультиязычной модели эмбеддингов и механизма расширения запросов. Распределение качества поиска по тематическим категориям приведено в таблице 6 и на рисунке 6.</w:t>
       </w:r>
     </w:p>
     <w:p>
@@ -11627,7 +11605,7 @@
         <w:jc w:val="center"/>
       </w:pPr>
       <w:r>
-        <w:t>Рисунок 7 – Качество поиска по тематическим категориям (nDCG@5)</w:t>
+        <w:t>Рисунок 6 – Качество поиска по тематическим категориям (nDCG@5)</w:t>
       </w:r>
     </w:p>
     <w:p>
@@ -12817,7 +12795,7 @@
         <w:jc w:val="center"/>
       </w:pPr>
       <w:r>
-        <w:t>Рисунок 5 – Инкрементальное обновление базы знаний: событийный и плановый контуры</w:t>
+        <w:t>Рисунок 7 – Инкрементальное обновление базы знаний: событийный и плановый контуры</w:t>
       </w:r>
     </w:p>
     <w:p>
@@ -12825,7 +12803,7 @@
         <w:pStyle w:val="Ttulo3"/>
       </w:pPr>
       <w:r>
-        <w:t>Конкурентный доступ и устойчивость в многорабочей среде</w:t>
+        <w:t>Конкурентный доступ и устойчивость в многопроцессной среде</w:t>
       </w:r>
     </w:p>
     <w:p>
@@ -13001,23 +12979,7 @@
         <w:jc w:val="both"/>
       </w:pPr>
       <w:r>
-        <w:rPr>
-          <w:b/>
-          <w:sz w:val="28"/>
-        </w:rPr>
-        <w:t xml:space="preserve">Ограничения исследования. </w:t>
-      </w:r>
-      <w:r>
-        <w:rPr>
-          <w:sz w:val="28"/>
-        </w:rPr>
-        <w:t>При интерпретации полученных результатов необходимо учитывать ряд ограничений. Во-первых, экспериментальная оценка проводилась на тестовом наборе ограниченного объёма (36 запросов), а разметка эталонных данных выполнялась одним экспертом. Во-вторых, в качестве языковой модели использовалась локально развёрнутая модель семейства LLaMA, при этом сравнение с современными облачными моделями (в частности, GPT-4) в рамках настоящей работы не проводилось. В-третьих, база знаний ограничена предметной областью Кубанского государственного университета и связанных с ним административных сервисов, что накладывает ограничения на прямое обобщение результатов на другие организации.</w:t>
-      </w:r>
-      <w:r>
-        <w:rPr>
-          <w:sz w:val="28"/>
-        </w:rPr>
-        <w:t xml:space="preserve"> В-четвёртых, модульное покрытие центрального модуля enhanced_rag.py составляет 57 %, что ниже общего показателя покрытия (71 %) и определяет направление дальнейшего совершенствования тестовой базы.</w:t>
+        <w:t>Ограничения исследования. При интерпретации полученных результатов необходимо учитывать ряд ограничений. Во-первых, экспериментальная оценка проводилась на тестовом наборе ограниченного объёма (36 запросов), а разметка эталонных данных выполнялась одним экспертом. Во-вторых, в качестве языковой модели использовалась локально развёрнутая модель Qwen2.5 (7B-Instruct, Q4_K_M), при этом сравнение с современными облачными моделями (в частности, GPT-4) в рамках настоящей работы не проводилось. В-третьих, база знаний ограничена предметной областью Кубанского государственного университета и связанных с ним административных сервисов, что накладывает ограничения на прямое обобщение результатов на другие организации. В-четвёртых, модульное покрытие центрального модуля enhanced_rag.py составляет 57 %, что ниже общего показателя покрытия (71 %) и определяет направление дальнейшего совершенствования тестовой базы.</w:t>
       </w:r>
     </w:p>
     <w:p>

</xml_diff>